<commit_message>
docs: sync project documentation with runtime schema
</commit_message>
<xml_diff>
--- a/docs/project-report.docx
+++ b/docs/project-report.docx
@@ -38,11 +38,9 @@
         <w:rPr>
           <w:b/>
         </w:rPr>
-        <w:t>วันตรวจ source:</w:t>
+        <w:t>วันตรวจ source: 30 ตุลาคม 2026</w:t>
       </w:r>
-      <w:r>
-        <w:t xml:space="preserve"> 19 ตุลาคม 2026</w:t>
-      </w:r>
+      <w:r/>
     </w:p>
     <w:p>
       <w:pPr>
@@ -443,32 +441,29 @@
               <w:rPr>
                 <w:sz w:val="16"/>
               </w:rPr>
-            </w:r>
-            <w:r>
-              <w:rPr>
-                <w:sz w:val="16"/>
-              </w:rPr>
-              <w:t xml:space="preserve">React 19 + Vite, Node.js + Express, SQLite ผ่าน </w:t>
+              <w:t>React 19 + Vite, Node.js + Express, SQLite ผ่าน sqlite3; startup สร้าง 14 ตารางใน backend/db.js</w:t>
+            </w:r>
+            <w:r>
+              <w:rPr>
+                <w:sz w:val="16"/>
+              </w:rPr>
             </w:r>
             <w:r>
               <w:rPr>
                 <w:rFonts w:ascii="Consolas" w:hAnsi="Consolas"/>
                 <w:sz w:val="16"/>
               </w:rPr>
-              <w:t>sqlite3</w:t>
-            </w:r>
-            <w:r>
-              <w:rPr>
-                <w:sz w:val="16"/>
-              </w:rPr>
-              <w:t xml:space="preserve">; startup สร้าง 13 ตารางใน </w:t>
+            </w:r>
+            <w:r>
+              <w:rPr>
+                <w:sz w:val="16"/>
+              </w:rPr>
             </w:r>
             <w:r>
               <w:rPr>
                 <w:rFonts w:ascii="Consolas" w:hAnsi="Consolas"/>
                 <w:sz w:val="16"/>
               </w:rPr>
-              <w:t>backend/db.js</w:t>
             </w:r>
           </w:p>
         </w:tc>
@@ -1577,12 +1572,12 @@
               <w:rPr>
                 <w:sz w:val="16"/>
               </w:rPr>
-            </w:r>
-            <w:r>
-              <w:rPr>
-                <w:sz w:val="16"/>
-              </w:rPr>
-              <w:t>Session cookie; API role guards; owner จัดการบัญชีและ reset password</w:t>
+              <w:t>Session cookie; API role guards; cashier/barista ผูกสาขาประจำ; owner จัดการบัญชีและกำหนดสาขา/reset password</w:t>
+            </w:r>
+            <w:r>
+              <w:rPr>
+                <w:sz w:val="16"/>
+              </w:rPr>
             </w:r>
           </w:p>
         </w:tc>
@@ -1783,194 +1778,166 @@
               <w:rPr>
                 <w:sz w:val="16"/>
               </w:rPr>
-            </w:r>
-            <w:r>
-              <w:rPr>
-                <w:sz w:val="16"/>
-              </w:rPr>
-              <w:t xml:space="preserve">13 ตาราง runtime: </w:t>
+              <w:t>14 ตาราง runtime: branches, categories, products, product_options, orders, order_items, inventory, inventory_stock, product_recipes, product_recipe_rules, inventory_movements, schema_migrations, users, sessions; options_json เก็บตัวเลือกและ snapshot วัตถุดิบที่ใช้</w:t>
+            </w:r>
+            <w:r>
+              <w:rPr>
+                <w:sz w:val="16"/>
+              </w:rPr>
             </w:r>
             <w:r>
               <w:rPr>
                 <w:rFonts w:ascii="Consolas" w:hAnsi="Consolas"/>
                 <w:sz w:val="16"/>
               </w:rPr>
-              <w:t>branches</w:t>
-            </w:r>
-            <w:r>
-              <w:rPr>
-                <w:sz w:val="16"/>
-              </w:rPr>
-              <w:t xml:space="preserve">, </w:t>
+            </w:r>
+            <w:r>
+              <w:rPr>
+                <w:sz w:val="16"/>
+              </w:rPr>
             </w:r>
             <w:r>
               <w:rPr>
                 <w:rFonts w:ascii="Consolas" w:hAnsi="Consolas"/>
                 <w:sz w:val="16"/>
               </w:rPr>
-              <w:t>categories</w:t>
-            </w:r>
-            <w:r>
-              <w:rPr>
-                <w:sz w:val="16"/>
-              </w:rPr>
-              <w:t xml:space="preserve">, </w:t>
+            </w:r>
+            <w:r>
+              <w:rPr>
+                <w:sz w:val="16"/>
+              </w:rPr>
             </w:r>
             <w:r>
               <w:rPr>
                 <w:rFonts w:ascii="Consolas" w:hAnsi="Consolas"/>
                 <w:sz w:val="16"/>
               </w:rPr>
-              <w:t>products</w:t>
-            </w:r>
-            <w:r>
-              <w:rPr>
-                <w:sz w:val="16"/>
-              </w:rPr>
-              <w:t xml:space="preserve">, </w:t>
+            </w:r>
+            <w:r>
+              <w:rPr>
+                <w:sz w:val="16"/>
+              </w:rPr>
             </w:r>
             <w:r>
               <w:rPr>
                 <w:rFonts w:ascii="Consolas" w:hAnsi="Consolas"/>
                 <w:sz w:val="16"/>
               </w:rPr>
-              <w:t>product_options</w:t>
-            </w:r>
-            <w:r>
-              <w:rPr>
-                <w:sz w:val="16"/>
-              </w:rPr>
-              <w:t xml:space="preserve">, </w:t>
+            </w:r>
+            <w:r>
+              <w:rPr>
+                <w:sz w:val="16"/>
+              </w:rPr>
             </w:r>
             <w:r>
               <w:rPr>
                 <w:rFonts w:ascii="Consolas" w:hAnsi="Consolas"/>
                 <w:sz w:val="16"/>
               </w:rPr>
-              <w:t>orders</w:t>
-            </w:r>
-            <w:r>
-              <w:rPr>
-                <w:sz w:val="16"/>
-              </w:rPr>
-              <w:t xml:space="preserve">, </w:t>
+            </w:r>
+            <w:r>
+              <w:rPr>
+                <w:sz w:val="16"/>
+              </w:rPr>
             </w:r>
             <w:r>
               <w:rPr>
                 <w:rFonts w:ascii="Consolas" w:hAnsi="Consolas"/>
                 <w:sz w:val="16"/>
               </w:rPr>
-              <w:t>order_items</w:t>
-            </w:r>
-            <w:r>
-              <w:rPr>
-                <w:sz w:val="16"/>
-              </w:rPr>
-              <w:t xml:space="preserve">, </w:t>
+            </w:r>
+            <w:r>
+              <w:rPr>
+                <w:sz w:val="16"/>
+              </w:rPr>
             </w:r>
             <w:r>
               <w:rPr>
                 <w:rFonts w:ascii="Consolas" w:hAnsi="Consolas"/>
                 <w:sz w:val="16"/>
               </w:rPr>
-              <w:t>inventory</w:t>
-            </w:r>
-            <w:r>
-              <w:rPr>
-                <w:sz w:val="16"/>
-              </w:rPr>
-              <w:t xml:space="preserve">, </w:t>
+            </w:r>
+            <w:r>
+              <w:rPr>
+                <w:sz w:val="16"/>
+              </w:rPr>
             </w:r>
             <w:r>
               <w:rPr>
                 <w:rFonts w:ascii="Consolas" w:hAnsi="Consolas"/>
                 <w:sz w:val="16"/>
               </w:rPr>
-              <w:t>product_recipes</w:t>
-            </w:r>
-            <w:r>
-              <w:rPr>
-                <w:sz w:val="16"/>
-              </w:rPr>
-              <w:t xml:space="preserve">, </w:t>
+            </w:r>
+            <w:r>
+              <w:rPr>
+                <w:sz w:val="16"/>
+              </w:rPr>
             </w:r>
             <w:r>
               <w:rPr>
                 <w:rFonts w:ascii="Consolas" w:hAnsi="Consolas"/>
                 <w:sz w:val="16"/>
               </w:rPr>
-              <w:t>product_recipe_rules</w:t>
-            </w:r>
-            <w:r>
-              <w:rPr>
-                <w:sz w:val="16"/>
-              </w:rPr>
-              <w:t xml:space="preserve">, </w:t>
+            </w:r>
+            <w:r>
+              <w:rPr>
+                <w:sz w:val="16"/>
+              </w:rPr>
             </w:r>
             <w:r>
               <w:rPr>
                 <w:rFonts w:ascii="Consolas" w:hAnsi="Consolas"/>
                 <w:sz w:val="16"/>
               </w:rPr>
-              <w:t>inventory_movements</w:t>
-            </w:r>
-            <w:r>
-              <w:rPr>
-                <w:sz w:val="16"/>
-              </w:rPr>
-              <w:t xml:space="preserve">, </w:t>
+            </w:r>
+            <w:r>
+              <w:rPr>
+                <w:sz w:val="16"/>
+              </w:rPr>
             </w:r>
             <w:r>
               <w:rPr>
                 <w:rFonts w:ascii="Consolas" w:hAnsi="Consolas"/>
                 <w:sz w:val="16"/>
               </w:rPr>
-              <w:t>schema_migrations</w:t>
-            </w:r>
-            <w:r>
-              <w:rPr>
-                <w:sz w:val="16"/>
-              </w:rPr>
-              <w:t xml:space="preserve">, </w:t>
+            </w:r>
+            <w:r>
+              <w:rPr>
+                <w:sz w:val="16"/>
+              </w:rPr>
             </w:r>
             <w:r>
               <w:rPr>
                 <w:rFonts w:ascii="Consolas" w:hAnsi="Consolas"/>
                 <w:sz w:val="16"/>
               </w:rPr>
-              <w:t>users</w:t>
-            </w:r>
-            <w:r>
-              <w:rPr>
-                <w:sz w:val="16"/>
-              </w:rPr>
-              <w:t xml:space="preserve">, </w:t>
+            </w:r>
+            <w:r>
+              <w:rPr>
+                <w:sz w:val="16"/>
+              </w:rPr>
             </w:r>
             <w:r>
               <w:rPr>
                 <w:rFonts w:ascii="Consolas" w:hAnsi="Consolas"/>
                 <w:sz w:val="16"/>
               </w:rPr>
-              <w:t>sessions</w:t>
-            </w:r>
-            <w:r>
-              <w:rPr>
-                <w:sz w:val="16"/>
-              </w:rPr>
-              <w:t xml:space="preserve">; </w:t>
+            </w:r>
+            <w:r>
+              <w:rPr>
+                <w:sz w:val="16"/>
+              </w:rPr>
             </w:r>
             <w:r>
               <w:rPr>
                 <w:rFonts w:ascii="Consolas" w:hAnsi="Consolas"/>
                 <w:sz w:val="16"/>
               </w:rPr>
-              <w:t>options_json</w:t>
-            </w:r>
-            <w:r>
-              <w:rPr>
-                <w:sz w:val="16"/>
-              </w:rPr>
-              <w:t xml:space="preserve"> เก็บตัวเลือกและ snapshot วัตถุดิบที่ใช้</w:t>
+            </w:r>
+            <w:r>
+              <w:rPr>
+                <w:sz w:val="16"/>
+              </w:rPr>
             </w:r>
           </w:p>
         </w:tc>
@@ -1987,32 +1954,29 @@
               <w:rPr>
                 <w:sz w:val="16"/>
               </w:rPr>
+              <w:t>product_recipes เป็น legacy; orders.branch_id และ inventory_movements.branch_id ยังไม่มี FK</w:t>
             </w:r>
             <w:r>
               <w:rPr>
                 <w:rFonts w:ascii="Consolas" w:hAnsi="Consolas"/>
                 <w:sz w:val="16"/>
               </w:rPr>
-              <w:t>product_recipes</w:t>
-            </w:r>
-            <w:r>
-              <w:rPr>
-                <w:sz w:val="16"/>
-              </w:rPr>
-              <w:t xml:space="preserve"> เป็น legacy สำหรับ migration; </w:t>
+            </w:r>
+            <w:r>
+              <w:rPr>
+                <w:sz w:val="16"/>
+              </w:rPr>
             </w:r>
             <w:r>
               <w:rPr>
                 <w:rFonts w:ascii="Consolas" w:hAnsi="Consolas"/>
                 <w:sz w:val="16"/>
               </w:rPr>
-              <w:t>orders.branch_id</w:t>
-            </w:r>
-            <w:r>
-              <w:rPr>
-                <w:sz w:val="16"/>
-              </w:rPr>
-              <w:t xml:space="preserve"> ยังไม่มี FK</w:t>
+            </w:r>
+            <w:r>
+              <w:rPr>
+                <w:sz w:val="16"/>
+              </w:rPr>
             </w:r>
           </w:p>
         </w:tc>
@@ -3089,39 +3053,35 @@
               <w:rPr>
                 <w:sz w:val="16"/>
               </w:rPr>
+              <w:t>/api/users, /api/users/:id/branch, /api/users/:id/active, /api/users/:id/password</w:t>
             </w:r>
             <w:r>
               <w:rPr>
                 <w:rFonts w:ascii="Consolas" w:hAnsi="Consolas"/>
                 <w:sz w:val="16"/>
               </w:rPr>
-              <w:t>/api/users</w:t>
-            </w:r>
-            <w:r>
-              <w:rPr>
-                <w:sz w:val="16"/>
-              </w:rPr>
-              <w:t xml:space="preserve">, </w:t>
+            </w:r>
+            <w:r>
+              <w:rPr>
+                <w:sz w:val="16"/>
+              </w:rPr>
             </w:r>
             <w:r>
               <w:rPr>
                 <w:rFonts w:ascii="Consolas" w:hAnsi="Consolas"/>
                 <w:sz w:val="16"/>
               </w:rPr>
-              <w:t>/api/users/:id/active</w:t>
-            </w:r>
-            <w:r>
-              <w:rPr>
-                <w:sz w:val="16"/>
-              </w:rPr>
-              <w:t xml:space="preserve">, </w:t>
+            </w:r>
+            <w:r>
+              <w:rPr>
+                <w:sz w:val="16"/>
+              </w:rPr>
             </w:r>
             <w:r>
               <w:rPr>
                 <w:rFonts w:ascii="Consolas" w:hAnsi="Consolas"/>
                 <w:sz w:val="16"/>
               </w:rPr>
-              <w:t>/api/users/:id/password</w:t>
             </w:r>
           </w:p>
         </w:tc>

</xml_diff>